<commit_message>
Camera reworked, Game speed added
</commit_message>
<xml_diff>
--- a/BuildNotes.docx
+++ b/BuildNotes.docx
@@ -154,7 +154,7 @@
         <w:rPr>
           <w:lang w:val="en-US"/>
         </w:rPr>
-        <w:t>Add new resources (Food, Fuel, etc.) and buildings</w:t>
+        <w:t>Add new resources and buildings</w:t>
       </w:r>
       <w:r>
         <w:t>.</w:t>
@@ -411,7 +411,13 @@
         <w:t>Game Speed Options:</w:t>
       </w:r>
       <w:r>
-        <w:t xml:space="preserve"> Add Speed 2x, 4x, etc. </w:t>
+        <w:t xml:space="preserve"> Add Speed </w:t>
+      </w:r>
+      <w:r>
+        <w:t xml:space="preserve">0.5x, regular, </w:t>
+      </w:r>
+      <w:r>
+        <w:t xml:space="preserve">2x, 4x, etc. </w:t>
       </w:r>
     </w:p>
     <w:p>
@@ -537,7 +543,13 @@
         <w:t>Options Menu:</w:t>
       </w:r>
       <w:r>
-        <w:t xml:space="preserve"> Sound/Music, Autosave time, </w:t>
+        <w:t xml:space="preserve"> Sound/Music, Autosave time,</w:t>
+      </w:r>
+      <w:r>
+        <w:t xml:space="preserve"> etc.</w:t>
+      </w:r>
+      <w:r>
+        <w:t xml:space="preserve"> </w:t>
       </w:r>
     </w:p>
     <w:p>
@@ -653,6 +665,246 @@
       </w:r>
     </w:p>
     <w:p>
+      <w:pPr>
+        <w:rPr>
+          <w:b/>
+          <w:bCs/>
+        </w:rPr>
+      </w:pPr>
+      <w:r>
+        <w:rPr>
+          <w:b/>
+          <w:bCs/>
+        </w:rPr>
+        <w:t>New buildings</w:t>
+      </w:r>
+      <w:r>
+        <w:rPr>
+          <w:b/>
+          <w:bCs/>
+        </w:rPr>
+        <w:t xml:space="preserve"> and objects</w:t>
+      </w:r>
+      <w:r>
+        <w:rPr>
+          <w:b/>
+          <w:bCs/>
+        </w:rPr>
+        <w:t>:</w:t>
+      </w:r>
+    </w:p>
+    <w:p>
+      <w:pPr>
+        <w:pStyle w:val="ListParagraph"/>
+        <w:numPr>
+          <w:ilvl w:val="0"/>
+          <w:numId w:val="10"/>
+        </w:numPr>
+      </w:pPr>
+      <w:r>
+        <w:t xml:space="preserve">Food: </w:t>
+      </w:r>
+      <w:r>
+        <w:t>crops</w:t>
+      </w:r>
+      <w:r>
+        <w:t xml:space="preserve"> fields</w:t>
+      </w:r>
+      <w:r>
+        <w:t>,</w:t>
+      </w:r>
+      <w:r>
+        <w:t xml:space="preserve"> </w:t>
+      </w:r>
+      <w:r>
+        <w:t>t</w:t>
+      </w:r>
+      <w:r>
+        <w:t xml:space="preserve">hreshing </w:t>
+      </w:r>
+      <w:r>
+        <w:t>floor</w:t>
+      </w:r>
+      <w:r>
+        <w:t>, fruits</w:t>
+      </w:r>
+      <w:r>
+        <w:t>,</w:t>
+      </w:r>
+      <w:r>
+        <w:t xml:space="preserve"> animals</w:t>
+      </w:r>
+      <w:r>
+        <w:t>,</w:t>
+      </w:r>
+      <w:r>
+        <w:t xml:space="preserve"> smokehouse,</w:t>
+      </w:r>
+      <w:r>
+        <w:t xml:space="preserve"> </w:t>
+      </w:r>
+      <w:r>
+        <w:t>d</w:t>
+      </w:r>
+      <w:r>
+        <w:t xml:space="preserve">rying </w:t>
+      </w:r>
+      <w:r>
+        <w:t>r</w:t>
+      </w:r>
+      <w:r>
+        <w:t>acks</w:t>
+      </w:r>
+      <w:r>
+        <w:t>, fishery, w</w:t>
+      </w:r>
+      <w:r>
+        <w:t>atermills/windmills.</w:t>
+      </w:r>
+    </w:p>
+    <w:p>
+      <w:pPr>
+        <w:pStyle w:val="ListParagraph"/>
+        <w:numPr>
+          <w:ilvl w:val="0"/>
+          <w:numId w:val="10"/>
+        </w:numPr>
+      </w:pPr>
+      <w:r>
+        <w:t>Water: well, rainwater, rivers, brewery, winery, mead</w:t>
+      </w:r>
+    </w:p>
+    <w:p>
+      <w:pPr>
+        <w:pStyle w:val="ListParagraph"/>
+        <w:numPr>
+          <w:ilvl w:val="0"/>
+          <w:numId w:val="10"/>
+        </w:numPr>
+      </w:pPr>
+      <w:r>
+        <w:t>Iron: deposits (</w:t>
+      </w:r>
+      <w:r>
+        <w:t>with several grades</w:t>
+      </w:r>
+      <w:r>
+        <w:t>), smelting station (near deposit), blacksmith, w</w:t>
+      </w:r>
+      <w:r>
+        <w:t>eaponsmith</w:t>
+      </w:r>
+      <w:r>
+        <w:t>,</w:t>
+      </w:r>
+      <w:r>
+        <w:t xml:space="preserve"> </w:t>
+      </w:r>
+      <w:r>
+        <w:t>a</w:t>
+      </w:r>
+      <w:r>
+        <w:t>rmorer</w:t>
+      </w:r>
+    </w:p>
+    <w:p>
+      <w:pPr>
+        <w:pStyle w:val="ListParagraph"/>
+        <w:numPr>
+          <w:ilvl w:val="0"/>
+          <w:numId w:val="10"/>
+        </w:numPr>
+      </w:pPr>
+      <w:r>
+        <w:t xml:space="preserve">Fuel: </w:t>
+      </w:r>
+      <w:r>
+        <w:t xml:space="preserve">charcoal, </w:t>
+      </w:r>
+      <w:r>
+        <w:t>kilns</w:t>
+      </w:r>
+      <w:r>
+        <w:t>, peat</w:t>
+      </w:r>
+    </w:p>
+    <w:p>
+      <w:pPr>
+        <w:pStyle w:val="ListParagraph"/>
+        <w:numPr>
+          <w:ilvl w:val="0"/>
+          <w:numId w:val="10"/>
+        </w:numPr>
+      </w:pPr>
+      <w:r>
+        <w:t xml:space="preserve">Happiness: church, festivals/feasts </w:t>
+      </w:r>
+    </w:p>
+    <w:p>
+      <w:pPr>
+        <w:pStyle w:val="ListParagraph"/>
+        <w:numPr>
+          <w:ilvl w:val="0"/>
+          <w:numId w:val="10"/>
+        </w:numPr>
+      </w:pPr>
+      <w:r>
+        <w:t>War/Defense: barracks, towers, walls, gates</w:t>
+      </w:r>
+    </w:p>
+    <w:p>
+      <w:pPr>
+        <w:pStyle w:val="ListParagraph"/>
+        <w:numPr>
+          <w:ilvl w:val="0"/>
+          <w:numId w:val="10"/>
+        </w:numPr>
+      </w:pPr>
+      <w:r>
+        <w:t xml:space="preserve">Roads/tracks: dirt, </w:t>
+      </w:r>
+      <w:r>
+        <w:t>ruts, raised roads, stone-paved roads</w:t>
+      </w:r>
+    </w:p>
+    <w:p>
+      <w:pPr>
+        <w:pStyle w:val="ListParagraph"/>
+        <w:numPr>
+          <w:ilvl w:val="0"/>
+          <w:numId w:val="10"/>
+        </w:numPr>
+      </w:pPr>
+      <w:r>
+        <w:t>Housing: house with gardens</w:t>
+      </w:r>
+      <w:r>
+        <w:t xml:space="preserve"> </w:t>
+      </w:r>
+      <w:r>
+        <w:t>(don’t need food)</w:t>
+      </w:r>
+    </w:p>
+    <w:p>
+      <w:pPr>
+        <w:pStyle w:val="ListParagraph"/>
+        <w:numPr>
+          <w:ilvl w:val="0"/>
+          <w:numId w:val="10"/>
+        </w:numPr>
+      </w:pPr>
+      <w:r>
+        <w:t>Storage: granary, storehouse.</w:t>
+      </w:r>
+    </w:p>
+    <w:p>
+      <w:pPr>
+        <w:pStyle w:val="ListParagraph"/>
+        <w:numPr>
+          <w:ilvl w:val="0"/>
+          <w:numId w:val="10"/>
+        </w:numPr>
+      </w:pPr>
       <w:r>
         <w:pict w14:anchorId="4C90472C">
           <v:rect id="_x0000_i1025" style="width:0;height:1.5pt" o:hralign="center" o:hrstd="t" o:hr="t" fillcolor="#a0a0a0" stroked="f"/>
@@ -697,6 +949,39 @@
           <w:numId w:val="1"/>
         </w:numPr>
       </w:pPr>
+      <w:r>
+        <w:t>Add new resources</w:t>
+      </w:r>
+      <w:r>
+        <w:t xml:space="preserve"> with buildings</w:t>
+      </w:r>
+      <w:r>
+        <w:t xml:space="preserve">: </w:t>
+      </w:r>
+      <w:r>
+        <w:t xml:space="preserve">water, </w:t>
+      </w:r>
+      <w:r>
+        <w:t>food</w:t>
+      </w:r>
+      <w:r>
+        <w:t xml:space="preserve">, </w:t>
+      </w:r>
+      <w:r>
+        <w:t>iron</w:t>
+      </w:r>
+      <w:r>
+        <w:t xml:space="preserve">, </w:t>
+      </w:r>
+      <w:r>
+        <w:t>fuel</w:t>
+      </w:r>
+      <w:r>
+        <w:t xml:space="preserve">, </w:t>
+      </w:r>
+      <w:r>
+        <w:t>maybe leather</w:t>
+      </w:r>
     </w:p>
     <w:p>
       <w:pPr>
@@ -705,6 +990,54 @@
           <w:numId w:val="1"/>
         </w:numPr>
       </w:pPr>
+      <w:r>
+        <w:t>New resource sources/deposits</w:t>
+      </w:r>
+    </w:p>
+    <w:p>
+      <w:pPr>
+        <w:numPr>
+          <w:ilvl w:val="0"/>
+          <w:numId w:val="1"/>
+        </w:numPr>
+      </w:pPr>
+      <w:r>
+        <w:t xml:space="preserve">Sound </w:t>
+      </w:r>
+      <w:r>
+        <w:t>m</w:t>
+      </w:r>
+      <w:r>
+        <w:t>anager with music/sound volume change</w:t>
+      </w:r>
+    </w:p>
+    <w:p>
+      <w:pPr>
+        <w:numPr>
+          <w:ilvl w:val="0"/>
+          <w:numId w:val="1"/>
+        </w:numPr>
+      </w:pPr>
+      <w:r>
+        <w:t>Rework camera to free movement (</w:t>
+      </w:r>
+      <w:r>
+        <w:t>with borders and</w:t>
+      </w:r>
+      <w:r>
+        <w:t xml:space="preserve"> collision)</w:t>
+      </w:r>
+    </w:p>
+    <w:p>
+      <w:pPr>
+        <w:numPr>
+          <w:ilvl w:val="0"/>
+          <w:numId w:val="1"/>
+        </w:numPr>
+      </w:pPr>
+      <w:r>
+        <w:t>Game Speed in options menu</w:t>
+      </w:r>
     </w:p>
     <w:p>
       <w:r>
@@ -737,6 +1070,9 @@
         </w:numPr>
       </w:pPr>
       <w:r>
+        <w:t>Market mechanic with options to buy and sell resources</w:t>
+      </w:r>
+      <w:r>
         <w:t xml:space="preserve"> </w:t>
       </w:r>
     </w:p>
@@ -747,9 +1083,83 @@
           <w:numId w:val="3"/>
         </w:numPr>
       </w:pPr>
-    </w:p>
-    <w:p>
-      <w:r>
+      <w:r>
+        <w:t>NPC resource gathering</w:t>
+      </w:r>
+    </w:p>
+    <w:p>
+      <w:pPr>
+        <w:numPr>
+          <w:ilvl w:val="0"/>
+          <w:numId w:val="3"/>
+        </w:numPr>
+      </w:pPr>
+      <w:r>
+        <w:t>UI for workers’ allocation</w:t>
+      </w:r>
+    </w:p>
+    <w:p>
+      <w:pPr>
+        <w:numPr>
+          <w:ilvl w:val="0"/>
+          <w:numId w:val="3"/>
+        </w:numPr>
+      </w:pPr>
+      <w:r>
+        <w:t>Loading screens at start and for scene transitions</w:t>
+      </w:r>
+    </w:p>
+    <w:p>
+      <w:pPr>
+        <w:numPr>
+          <w:ilvl w:val="0"/>
+          <w:numId w:val="3"/>
+        </w:numPr>
+      </w:pPr>
+      <w:r>
+        <w:t xml:space="preserve">Day/night transition, 1 day </w:t>
+      </w:r>
+      <w:r>
+        <w:t>=</w:t>
+      </w:r>
+      <w:r>
+        <w:t xml:space="preserve"> </w:t>
+      </w:r>
+      <w:r>
+        <w:t>6</w:t>
+      </w:r>
+      <w:r>
+        <w:t xml:space="preserve"> minutes</w:t>
+      </w:r>
+    </w:p>
+    <w:p>
+      <w:pPr>
+        <w:numPr>
+          <w:ilvl w:val="0"/>
+          <w:numId w:val="3"/>
+        </w:numPr>
+      </w:pPr>
+      <w:r>
+        <w:t>Weather and season change</w:t>
+      </w:r>
+      <w:r>
+        <w:t xml:space="preserve"> (enable/disable for some scenarios)</w:t>
+      </w:r>
+    </w:p>
+    <w:p>
+      <w:pPr>
+        <w:numPr>
+          <w:ilvl w:val="0"/>
+          <w:numId w:val="3"/>
+        </w:numPr>
+      </w:pPr>
+      <w:r>
+        <w:t>Defensive buildings</w:t>
+      </w:r>
+    </w:p>
+    <w:p>
+      <w:r>
+        <w:lastRenderedPageBreak/>
         <w:pict w14:anchorId="6D36ED86">
           <v:rect id="_x0000_i1027" style="width:0;height:1.5pt" o:hralign="center" o:hrstd="t" o:hr="t" fillcolor="#a0a0a0" stroked="f"/>
         </w:pict>
@@ -778,6 +1188,21 @@
           <w:numId w:val="4"/>
         </w:numPr>
       </w:pPr>
+      <w:r>
+        <w:t>Resume/</w:t>
+      </w:r>
+      <w:r>
+        <w:t>Save</w:t>
+      </w:r>
+      <w:r>
+        <w:t>/AutoSave</w:t>
+      </w:r>
+      <w:r>
+        <w:t xml:space="preserve">/Load </w:t>
+      </w:r>
+      <w:r>
+        <w:t>the game</w:t>
+      </w:r>
     </w:p>
     <w:p>
       <w:pPr>
@@ -786,6 +1211,103 @@
           <w:numId w:val="4"/>
         </w:numPr>
       </w:pPr>
+      <w:r>
+        <w:t>Menu for game selection</w:t>
+      </w:r>
+    </w:p>
+    <w:p>
+      <w:pPr>
+        <w:numPr>
+          <w:ilvl w:val="0"/>
+          <w:numId w:val="4"/>
+        </w:numPr>
+      </w:pPr>
+      <w:r>
+        <w:t>1 campaign mission for Demo</w:t>
+      </w:r>
+    </w:p>
+    <w:p>
+      <w:pPr>
+        <w:numPr>
+          <w:ilvl w:val="0"/>
+          <w:numId w:val="4"/>
+        </w:numPr>
+      </w:pPr>
+      <w:r>
+        <w:t>Add troops that could be controlled</w:t>
+      </w:r>
+    </w:p>
+    <w:p>
+      <w:pPr>
+        <w:numPr>
+          <w:ilvl w:val="0"/>
+          <w:numId w:val="4"/>
+        </w:numPr>
+      </w:pPr>
+      <w:r>
+        <w:t>Progression tree</w:t>
+      </w:r>
+      <w:r>
+        <w:t xml:space="preserve"> with unlocking buildings and upgrades</w:t>
+      </w:r>
+    </w:p>
+    <w:p>
+      <w:pPr>
+        <w:numPr>
+          <w:ilvl w:val="0"/>
+          <w:numId w:val="4"/>
+        </w:numPr>
+      </w:pPr>
+      <w:r>
+        <w:t>Creative mode with no limits</w:t>
+      </w:r>
+    </w:p>
+    <w:p>
+      <w:pPr>
+        <w:numPr>
+          <w:ilvl w:val="0"/>
+          <w:numId w:val="4"/>
+        </w:numPr>
+      </w:pPr>
+      <w:r>
+        <w:t>Mini map</w:t>
+      </w:r>
+    </w:p>
+    <w:p>
+      <w:pPr>
+        <w:numPr>
+          <w:ilvl w:val="0"/>
+          <w:numId w:val="4"/>
+        </w:numPr>
+      </w:pPr>
+      <w:r>
+        <w:t xml:space="preserve">Create Steam page and release a demo for </w:t>
+      </w:r>
+      <w:r>
+        <w:t>Itch. Io</w:t>
+      </w:r>
+    </w:p>
+    <w:p>
+      <w:pPr>
+        <w:numPr>
+          <w:ilvl w:val="0"/>
+          <w:numId w:val="4"/>
+        </w:numPr>
+      </w:pPr>
+      <w:r>
+        <w:t>Enemy raids/waves with options to fight and buy out.</w:t>
+      </w:r>
+    </w:p>
+    <w:p>
+      <w:pPr>
+        <w:numPr>
+          <w:ilvl w:val="0"/>
+          <w:numId w:val="4"/>
+        </w:numPr>
+      </w:pPr>
+      <w:r>
+        <w:t>Scripts polish and optimization.</w:t>
+      </w:r>
     </w:p>
     <w:p>
       <w:pPr>
@@ -1071,72 +1593,72 @@
           <w:b/>
           <w:bCs/>
         </w:rPr>
+        <w:t>Mouse scroll wheel:</w:t>
+      </w:r>
+      <w:r>
+        <w:t xml:space="preserve"> Zoom in/out</w:t>
+      </w:r>
+    </w:p>
+    <w:p>
+      <w:pPr>
+        <w:numPr>
+          <w:ilvl w:val="0"/>
+          <w:numId w:val="7"/>
+        </w:numPr>
+      </w:pPr>
+      <w:r>
+        <w:rPr>
+          <w:b/>
+          <w:bCs/>
+        </w:rPr>
+        <w:t>Button “R” + Mouse Scroll Wheel</w:t>
+      </w:r>
+      <w:r>
+        <w:t>: Rotate the building.</w:t>
+      </w:r>
+    </w:p>
+    <w:p>
+      <w:pPr>
+        <w:numPr>
+          <w:ilvl w:val="0"/>
+          <w:numId w:val="7"/>
+        </w:numPr>
+      </w:pPr>
+      <w:r>
+        <w:rPr>
+          <w:b/>
+          <w:bCs/>
+        </w:rPr>
+        <w:t>Point at a building/path + Button “D”</w:t>
+      </w:r>
+      <w:r>
+        <w:t>:</w:t>
+      </w:r>
+      <w:r>
+        <w:t xml:space="preserve"> Delete the building/path</w:t>
+      </w:r>
+    </w:p>
+    <w:p>
+      <w:pPr>
+        <w:numPr>
+          <w:ilvl w:val="0"/>
+          <w:numId w:val="7"/>
+        </w:numPr>
+      </w:pPr>
+      <w:r>
+        <w:rPr>
+          <w:b/>
+          <w:bCs/>
+        </w:rPr>
+        <w:t>Button “P”</w:t>
+      </w:r>
+      <w:r>
+        <w:t>: Add resources</w:t>
+      </w:r>
+    </w:p>
+    <w:p>
+      <w:r>
         <w:lastRenderedPageBreak/>
-        <w:t>Mouse scroll wheel:</w:t>
-      </w:r>
-      <w:r>
-        <w:t xml:space="preserve"> Zoom in/out</w:t>
-      </w:r>
-    </w:p>
-    <w:p>
-      <w:pPr>
-        <w:numPr>
-          <w:ilvl w:val="0"/>
-          <w:numId w:val="7"/>
-        </w:numPr>
-      </w:pPr>
-      <w:r>
-        <w:rPr>
-          <w:b/>
-          <w:bCs/>
-        </w:rPr>
-        <w:t>Button “R” + Mouse Scroll Wheel</w:t>
-      </w:r>
-      <w:r>
-        <w:t>: Rotate the building.</w:t>
-      </w:r>
-    </w:p>
-    <w:p>
-      <w:pPr>
-        <w:numPr>
-          <w:ilvl w:val="0"/>
-          <w:numId w:val="7"/>
-        </w:numPr>
-      </w:pPr>
-      <w:r>
-        <w:rPr>
-          <w:b/>
-          <w:bCs/>
-        </w:rPr>
-        <w:t>Point at a building/path + Button “D”</w:t>
-      </w:r>
-      <w:r>
-        <w:t>:</w:t>
-      </w:r>
-      <w:r>
-        <w:t xml:space="preserve"> Delete the building/path</w:t>
-      </w:r>
-    </w:p>
-    <w:p>
-      <w:pPr>
-        <w:numPr>
-          <w:ilvl w:val="0"/>
-          <w:numId w:val="7"/>
-        </w:numPr>
-      </w:pPr>
-      <w:r>
-        <w:rPr>
-          <w:b/>
-          <w:bCs/>
-        </w:rPr>
-        <w:t>Button “P”</w:t>
-      </w:r>
-      <w:r>
-        <w:t>: Add resources</w:t>
-      </w:r>
-    </w:p>
-    <w:p>
-      <w:r>
         <w:pict w14:anchorId="7B1998C0">
           <v:rect id="_x0000_i1029" style="width:0;height:1.5pt" o:hralign="center" o:hrstd="t" o:hr="t" fillcolor="#a0a0a0" stroked="f"/>
         </w:pict>
@@ -3221,7 +3743,6 @@
   <w:style w:type="character" w:default="1" w:styleId="DefaultParagraphFont">
     <w:name w:val="Default Paragraph Font"/>
     <w:uiPriority w:val="1"/>
-    <w:semiHidden/>
     <w:unhideWhenUsed/>
   </w:style>
   <w:style w:type="table" w:default="1" w:styleId="TableNormal">

</xml_diff>

<commit_message>
Save/Load for options added.
</commit_message>
<xml_diff>
--- a/BuildNotes.docx
+++ b/BuildNotes.docx
@@ -86,22 +86,19 @@
         <w:t xml:space="preserve"> and prepare for </w:t>
       </w:r>
       <w:r>
-        <w:t xml:space="preserve">next </w:t>
+        <w:t>next “</w:t>
       </w:r>
       <w:r>
         <w:t xml:space="preserve">Steam </w:t>
       </w:r>
       <w:r>
-        <w:t>“</w:t>
-      </w:r>
-      <w:r>
         <w:t>Next Fest</w:t>
       </w:r>
       <w:r>
         <w:t>”</w:t>
       </w:r>
       <w:r>
-        <w:t xml:space="preserve"> (Summer or Autumn)</w:t>
+        <w:t xml:space="preserve"> (Summer)</w:t>
       </w:r>
       <w:r>
         <w:t>.</w:t>
@@ -269,7 +266,13 @@
         <w:t xml:space="preserve">n, </w:t>
       </w:r>
       <w:r>
-        <w:t>missions and</w:t>
+        <w:t>missions</w:t>
+      </w:r>
+      <w:r>
+        <w:t>, endless</w:t>
+      </w:r>
+      <w:r>
+        <w:t xml:space="preserve"> and</w:t>
       </w:r>
       <w:r>
         <w:t xml:space="preserve"> creative</w:t>
@@ -351,10 +354,42 @@
           <w:b/>
           <w:bCs/>
         </w:rPr>
-        <w:t>Save/Load:</w:t>
-      </w:r>
-      <w:r>
-        <w:t xml:space="preserve"> Add Autosave and save options and options to continue the game.</w:t>
+        <w:t>Save/Load</w:t>
+      </w:r>
+      <w:r>
+        <w:rPr>
+          <w:b/>
+          <w:bCs/>
+        </w:rPr>
+        <w:t>/Continue</w:t>
+      </w:r>
+      <w:r>
+        <w:rPr>
+          <w:b/>
+          <w:bCs/>
+        </w:rPr>
+        <w:t>:</w:t>
+      </w:r>
+      <w:r>
+        <w:t xml:space="preserve"> Add </w:t>
+      </w:r>
+      <w:r>
+        <w:t>a</w:t>
+      </w:r>
+      <w:r>
+        <w:t>utosave and save</w:t>
+      </w:r>
+      <w:r>
+        <w:t>/load</w:t>
+      </w:r>
+      <w:r>
+        <w:t xml:space="preserve"> options </w:t>
+      </w:r>
+      <w:r>
+        <w:t>+ resume last game</w:t>
+      </w:r>
+      <w:r>
+        <w:t>.</w:t>
       </w:r>
     </w:p>
     <w:p>
@@ -372,7 +407,19 @@
         <w:t>Path building:</w:t>
       </w:r>
       <w:r>
-        <w:t xml:space="preserve"> Develop a system for roads or paths teaches me procedural generation and connectivity logic for town planning</w:t>
+        <w:t xml:space="preserve"> Develop a system for roads or paths </w:t>
+      </w:r>
+      <w:r>
+        <w:t xml:space="preserve">for </w:t>
+      </w:r>
+      <w:r>
+        <w:t xml:space="preserve">connectivity logic </w:t>
+      </w:r>
+      <w:r>
+        <w:t>in</w:t>
+      </w:r>
+      <w:r>
+        <w:t xml:space="preserve"> town planning</w:t>
       </w:r>
       <w:r>
         <w:t>.</w:t>
@@ -393,7 +440,13 @@
         <w:t>Camera + controls:</w:t>
       </w:r>
       <w:r>
-        <w:t xml:space="preserve"> rework camera behaviour + controls.</w:t>
+        <w:t xml:space="preserve"> rework camera behaviour + controls</w:t>
+      </w:r>
+      <w:r>
+        <w:t xml:space="preserve"> to free movement and rotation</w:t>
+      </w:r>
+      <w:r>
+        <w:t>.</w:t>
       </w:r>
     </w:p>
     <w:p>
@@ -414,10 +467,28 @@
         <w:t xml:space="preserve"> Add Speed </w:t>
       </w:r>
       <w:r>
-        <w:t xml:space="preserve">0.5x, regular, </w:t>
-      </w:r>
-      <w:r>
-        <w:t xml:space="preserve">2x, 4x, etc. </w:t>
+        <w:t xml:space="preserve">0.5x, </w:t>
+      </w:r>
+      <w:r>
+        <w:t>1x</w:t>
+      </w:r>
+      <w:r>
+        <w:t xml:space="preserve">, </w:t>
+      </w:r>
+      <w:r>
+        <w:t>2x,</w:t>
+      </w:r>
+      <w:r>
+        <w:t xml:space="preserve"> </w:t>
+      </w:r>
+      <w:r>
+        <w:t>4x</w:t>
+      </w:r>
+      <w:r>
+        <w:t xml:space="preserve"> and pause/resume</w:t>
+      </w:r>
+      <w:r>
+        <w:t xml:space="preserve">. </w:t>
       </w:r>
     </w:p>
     <w:p>
@@ -471,7 +542,19 @@
         <w:t>Assets polish:</w:t>
       </w:r>
       <w:r>
-        <w:t xml:space="preserve"> Add more buildings, terrain and environment.</w:t>
+        <w:t xml:space="preserve"> Add more buildings</w:t>
+      </w:r>
+      <w:r>
+        <w:t xml:space="preserve"> for each resource</w:t>
+      </w:r>
+      <w:r>
+        <w:t>, terrain</w:t>
+      </w:r>
+      <w:r>
+        <w:t xml:space="preserve"> </w:t>
+      </w:r>
+      <w:r>
+        <w:t>and environment.</w:t>
       </w:r>
     </w:p>
     <w:p>
@@ -489,7 +572,25 @@
         <w:t>Mini map:</w:t>
       </w:r>
       <w:r>
-        <w:t xml:space="preserve"> Add map and fog of war</w:t>
+        <w:t xml:space="preserve"> Add</w:t>
+      </w:r>
+      <w:r>
+        <w:t xml:space="preserve"> </w:t>
+      </w:r>
+      <w:r>
+        <w:t>map</w:t>
+      </w:r>
+      <w:r>
+        <w:t xml:space="preserve"> </w:t>
+      </w:r>
+      <w:r>
+        <w:t xml:space="preserve">with lifetime layout </w:t>
+      </w:r>
+      <w:r>
+        <w:t>and fog of war</w:t>
+      </w:r>
+      <w:r>
+        <w:t>.</w:t>
       </w:r>
     </w:p>
     <w:p>
@@ -543,7 +644,16 @@
         <w:t>Options Menu:</w:t>
       </w:r>
       <w:r>
-        <w:t xml:space="preserve"> Sound/Music, Autosave time,</w:t>
+        <w:t xml:space="preserve"> Sound/Music, </w:t>
+      </w:r>
+      <w:r>
+        <w:t>a</w:t>
+      </w:r>
+      <w:r>
+        <w:t>utosave time,</w:t>
+      </w:r>
+      <w:r>
+        <w:t xml:space="preserve"> camera speed</w:t>
       </w:r>
       <w:r>
         <w:t xml:space="preserve"> etc.</w:t>
@@ -621,8 +731,23 @@
         </w:numPr>
       </w:pPr>
       <w:r>
+        <w:t>Diplomacy Is Not the Option</w:t>
+      </w:r>
+    </w:p>
+    <w:p>
+      <w:pPr>
+        <w:pStyle w:val="ListParagraph"/>
+        <w:numPr>
+          <w:ilvl w:val="0"/>
+          <w:numId w:val="10"/>
+        </w:numPr>
+      </w:pPr>
+      <w:r>
         <w:lastRenderedPageBreak/>
-        <w:t>Diplomacy Is Not the Option</w:t>
+        <w:t xml:space="preserve">Age of Empire </w:t>
+      </w:r>
+      <w:r>
+        <w:t>series</w:t>
       </w:r>
     </w:p>
     <w:p>
@@ -634,10 +759,7 @@
         </w:numPr>
       </w:pPr>
       <w:r>
-        <w:t xml:space="preserve">Age of Empire </w:t>
-      </w:r>
-      <w:r>
-        <w:t>series</w:t>
+        <w:t>Townsman (IOS)</w:t>
       </w:r>
     </w:p>
     <w:p>
@@ -649,7 +771,36 @@
         </w:numPr>
       </w:pPr>
       <w:r>
-        <w:t>Townsman (IOS)</w:t>
+        <w:t>Anno series</w:t>
+      </w:r>
+    </w:p>
+    <w:p>
+      <w:pPr>
+        <w:rPr>
+          <w:b/>
+          <w:bCs/>
+        </w:rPr>
+      </w:pPr>
+      <w:r>
+        <w:rPr>
+          <w:b/>
+          <w:bCs/>
+        </w:rPr>
+        <w:t>New buildings</w:t>
+      </w:r>
+      <w:r>
+        <w:rPr>
+          <w:b/>
+          <w:bCs/>
+        </w:rPr>
+        <w:t xml:space="preserve"> and objects</w:t>
+      </w:r>
+      <w:r>
+        <w:rPr>
+          <w:b/>
+          <w:bCs/>
+        </w:rPr>
+        <w:t>:</w:t>
       </w:r>
     </w:p>
     <w:p>
@@ -661,36 +812,61 @@
         </w:numPr>
       </w:pPr>
       <w:r>
-        <w:t>Anno series</w:t>
-      </w:r>
-    </w:p>
-    <w:p>
-      <w:pPr>
-        <w:rPr>
-          <w:b/>
-          <w:bCs/>
-        </w:rPr>
-      </w:pPr>
-      <w:r>
-        <w:rPr>
-          <w:b/>
-          <w:bCs/>
-        </w:rPr>
-        <w:t>New buildings</w:t>
-      </w:r>
-      <w:r>
-        <w:rPr>
-          <w:b/>
-          <w:bCs/>
-        </w:rPr>
-        <w:t xml:space="preserve"> and objects</w:t>
-      </w:r>
-      <w:r>
-        <w:rPr>
-          <w:b/>
-          <w:bCs/>
-        </w:rPr>
-        <w:t>:</w:t>
+        <w:t xml:space="preserve">Food: </w:t>
+      </w:r>
+      <w:r>
+        <w:t>crops</w:t>
+      </w:r>
+      <w:r>
+        <w:t xml:space="preserve"> fields</w:t>
+      </w:r>
+      <w:r>
+        <w:t>,</w:t>
+      </w:r>
+      <w:r>
+        <w:t xml:space="preserve"> </w:t>
+      </w:r>
+      <w:r>
+        <w:t>t</w:t>
+      </w:r>
+      <w:r>
+        <w:t>hreshing floor</w:t>
+      </w:r>
+      <w:r>
+        <w:t>, fruits</w:t>
+      </w:r>
+      <w:r>
+        <w:t>,</w:t>
+      </w:r>
+      <w:r>
+        <w:t xml:space="preserve"> animals</w:t>
+      </w:r>
+      <w:r>
+        <w:t>,</w:t>
+      </w:r>
+      <w:r>
+        <w:t xml:space="preserve"> smokehouse,</w:t>
+      </w:r>
+      <w:r>
+        <w:t xml:space="preserve"> </w:t>
+      </w:r>
+      <w:r>
+        <w:t>d</w:t>
+      </w:r>
+      <w:r>
+        <w:t xml:space="preserve">rying </w:t>
+      </w:r>
+      <w:r>
+        <w:t>r</w:t>
+      </w:r>
+      <w:r>
+        <w:t>acks</w:t>
+      </w:r>
+      <w:r>
+        <w:t>, fishery, w</w:t>
+      </w:r>
+      <w:r>
+        <w:t>atermills/windmills.</w:t>
       </w:r>
     </w:p>
     <w:p>
@@ -702,13 +878,22 @@
         </w:numPr>
       </w:pPr>
       <w:r>
-        <w:t xml:space="preserve">Food: </w:t>
-      </w:r>
-      <w:r>
-        <w:t>crops</w:t>
-      </w:r>
-      <w:r>
-        <w:t xml:space="preserve"> fields</w:t>
+        <w:t>Water: well, rainwater, rivers, brewery, winery, mead</w:t>
+      </w:r>
+    </w:p>
+    <w:p>
+      <w:pPr>
+        <w:pStyle w:val="ListParagraph"/>
+        <w:numPr>
+          <w:ilvl w:val="0"/>
+          <w:numId w:val="10"/>
+        </w:numPr>
+      </w:pPr>
+      <w:r>
+        <w:t>Iron: deposits (with several grades), smelting station (near deposit), blacksmith, w</w:t>
+      </w:r>
+      <w:r>
+        <w:t>eaponsmith</w:t>
       </w:r>
       <w:r>
         <w:t>,</w:t>
@@ -717,49 +902,10 @@
         <w:t xml:space="preserve"> </w:t>
       </w:r>
       <w:r>
-        <w:t>t</w:t>
-      </w:r>
-      <w:r>
-        <w:t xml:space="preserve">hreshing </w:t>
-      </w:r>
-      <w:r>
-        <w:t>floor</w:t>
-      </w:r>
-      <w:r>
-        <w:t>, fruits</w:t>
-      </w:r>
-      <w:r>
-        <w:t>,</w:t>
-      </w:r>
-      <w:r>
-        <w:t xml:space="preserve"> animals</w:t>
-      </w:r>
-      <w:r>
-        <w:t>,</w:t>
-      </w:r>
-      <w:r>
-        <w:t xml:space="preserve"> smokehouse,</w:t>
-      </w:r>
-      <w:r>
-        <w:t xml:space="preserve"> </w:t>
-      </w:r>
-      <w:r>
-        <w:t>d</w:t>
-      </w:r>
-      <w:r>
-        <w:t xml:space="preserve">rying </w:t>
-      </w:r>
-      <w:r>
-        <w:t>r</w:t>
-      </w:r>
-      <w:r>
-        <w:t>acks</w:t>
-      </w:r>
-      <w:r>
-        <w:t>, fishery, w</w:t>
-      </w:r>
-      <w:r>
-        <w:t>atermills/windmills.</w:t>
+        <w:t>a</w:t>
+      </w:r>
+      <w:r>
+        <w:t>rmorer</w:t>
       </w:r>
     </w:p>
     <w:p>
@@ -771,58 +917,10 @@
         </w:numPr>
       </w:pPr>
       <w:r>
-        <w:t>Water: well, rainwater, rivers, brewery, winery, mead</w:t>
-      </w:r>
-    </w:p>
-    <w:p>
-      <w:pPr>
-        <w:pStyle w:val="ListParagraph"/>
-        <w:numPr>
-          <w:ilvl w:val="0"/>
-          <w:numId w:val="10"/>
-        </w:numPr>
-      </w:pPr>
-      <w:r>
-        <w:t>Iron: deposits (</w:t>
-      </w:r>
-      <w:r>
-        <w:t>with several grades</w:t>
-      </w:r>
-      <w:r>
-        <w:t>), smelting station (near deposit), blacksmith, w</w:t>
-      </w:r>
-      <w:r>
-        <w:t>eaponsmith</w:t>
-      </w:r>
-      <w:r>
-        <w:t>,</w:t>
-      </w:r>
-      <w:r>
-        <w:t xml:space="preserve"> </w:t>
-      </w:r>
-      <w:r>
-        <w:t>a</w:t>
-      </w:r>
-      <w:r>
-        <w:t>rmorer</w:t>
-      </w:r>
-    </w:p>
-    <w:p>
-      <w:pPr>
-        <w:pStyle w:val="ListParagraph"/>
-        <w:numPr>
-          <w:ilvl w:val="0"/>
-          <w:numId w:val="10"/>
-        </w:numPr>
-      </w:pPr>
-      <w:r>
         <w:t xml:space="preserve">Fuel: </w:t>
       </w:r>
       <w:r>
-        <w:t xml:space="preserve">charcoal, </w:t>
-      </w:r>
-      <w:r>
-        <w:t>kilns</w:t>
+        <w:t>charcoal, kilns</w:t>
       </w:r>
       <w:r>
         <w:t>, peat</w:t>
@@ -950,37 +1048,7 @@
         </w:numPr>
       </w:pPr>
       <w:r>
-        <w:t>Add new resources</w:t>
-      </w:r>
-      <w:r>
-        <w:t xml:space="preserve"> with buildings</w:t>
-      </w:r>
-      <w:r>
-        <w:t xml:space="preserve">: </w:t>
-      </w:r>
-      <w:r>
-        <w:t xml:space="preserve">water, </w:t>
-      </w:r>
-      <w:r>
-        <w:t>food</w:t>
-      </w:r>
-      <w:r>
-        <w:t xml:space="preserve">, </w:t>
-      </w:r>
-      <w:r>
-        <w:t>iron</w:t>
-      </w:r>
-      <w:r>
-        <w:t xml:space="preserve">, </w:t>
-      </w:r>
-      <w:r>
-        <w:t>fuel</w:t>
-      </w:r>
-      <w:r>
-        <w:t xml:space="preserve">, </w:t>
-      </w:r>
-      <w:r>
-        <w:t>maybe leather</w:t>
+        <w:t>Finish game documentation with all details needed for the game</w:t>
       </w:r>
     </w:p>
     <w:p>
@@ -991,7 +1059,13 @@
         </w:numPr>
       </w:pPr>
       <w:r>
-        <w:t>New resource sources/deposits</w:t>
+        <w:t xml:space="preserve">Sound </w:t>
+      </w:r>
+      <w:r>
+        <w:t>m</w:t>
+      </w:r>
+      <w:r>
+        <w:t>anager with music/sound volume change</w:t>
       </w:r>
     </w:p>
     <w:p>
@@ -1002,13 +1076,13 @@
         </w:numPr>
       </w:pPr>
       <w:r>
-        <w:t xml:space="preserve">Sound </w:t>
-      </w:r>
-      <w:r>
-        <w:t>m</w:t>
-      </w:r>
-      <w:r>
-        <w:t>anager with music/sound volume change</w:t>
+        <w:t>Rework camera to free movement (</w:t>
+      </w:r>
+      <w:r>
+        <w:t>with borders and</w:t>
+      </w:r>
+      <w:r>
+        <w:t xml:space="preserve"> collision)</w:t>
       </w:r>
     </w:p>
     <w:p>
@@ -1019,13 +1093,7 @@
         </w:numPr>
       </w:pPr>
       <w:r>
-        <w:t>Rework camera to free movement (</w:t>
-      </w:r>
-      <w:r>
-        <w:t>with borders and</w:t>
-      </w:r>
-      <w:r>
-        <w:t xml:space="preserve"> collision)</w:t>
+        <w:t>Camera speed slider</w:t>
       </w:r>
     </w:p>
     <w:p>
@@ -1036,17 +1104,48 @@
         </w:numPr>
       </w:pPr>
       <w:r>
-        <w:t>Game Speed in options menu</w:t>
+        <w:t xml:space="preserve">Game Speed </w:t>
+      </w:r>
+      <w:r>
+        <w:t>0.5x,1x, 2x, 4x, with UI</w:t>
+      </w:r>
+    </w:p>
+    <w:p>
+      <w:pPr>
+        <w:numPr>
+          <w:ilvl w:val="0"/>
+          <w:numId w:val="1"/>
+        </w:numPr>
+      </w:pPr>
+      <w:r>
+        <w:t>Increase the building area and update generation</w:t>
+      </w:r>
+    </w:p>
+    <w:p>
+      <w:pPr>
+        <w:numPr>
+          <w:ilvl w:val="0"/>
+          <w:numId w:val="1"/>
+        </w:numPr>
+      </w:pPr>
+      <w:r>
+        <w:t>Brightness slider in options menu</w:t>
       </w:r>
     </w:p>
     <w:p>
       <w:r>
         <w:pict w14:anchorId="560732DB">
-          <v:rect id="_x0000_i1026" style="width:0;height:1.5pt" o:hralign="center" o:hrstd="t" o:hr="t" fillcolor="#a0a0a0" stroked="f"/>
+          <v:rect id="_x0000_i1034" style="width:0;height:1.5pt" o:hralign="center" o:hrstd="t" o:hr="t" fillcolor="#a0a0a0" stroked="f"/>
         </w:pict>
       </w:r>
     </w:p>
     <w:p>
+      <w:pPr>
+        <w:rPr>
+          <w:b/>
+          <w:bCs/>
+        </w:rPr>
+      </w:pPr>
       <w:r>
         <w:rPr>
           <w:b/>
@@ -1066,15 +1165,88 @@
       <w:pPr>
         <w:numPr>
           <w:ilvl w:val="0"/>
+          <w:numId w:val="1"/>
+        </w:numPr>
+      </w:pPr>
+      <w:r>
+        <w:t>Add new resources with buildings</w:t>
+      </w:r>
+      <w:r>
+        <w:t xml:space="preserve"> and deposits</w:t>
+      </w:r>
+      <w:r>
+        <w:t>: water, food, iron, fuel</w:t>
+      </w:r>
+    </w:p>
+    <w:p>
+      <w:pPr>
+        <w:numPr>
+          <w:ilvl w:val="0"/>
+          <w:numId w:val="1"/>
+        </w:numPr>
+      </w:pPr>
+      <w:r>
+        <w:t>Market mechanic with options to buy and sell resources</w:t>
+      </w:r>
+      <w:r>
+        <w:t xml:space="preserve"> </w:t>
+      </w:r>
+    </w:p>
+    <w:p>
+      <w:pPr>
+        <w:numPr>
+          <w:ilvl w:val="0"/>
           <w:numId w:val="3"/>
         </w:numPr>
       </w:pPr>
       <w:r>
-        <w:t>Market mechanic with options to buy and sell resources</w:t>
+        <w:t>NPC resource gathering</w:t>
+      </w:r>
+    </w:p>
+    <w:p>
+      <w:pPr>
+        <w:numPr>
+          <w:ilvl w:val="0"/>
+          <w:numId w:val="3"/>
+        </w:numPr>
+      </w:pPr>
+      <w:r>
+        <w:t>UI for workers’ allocation</w:t>
+      </w:r>
+    </w:p>
+    <w:p>
+      <w:pPr>
+        <w:numPr>
+          <w:ilvl w:val="0"/>
+          <w:numId w:val="3"/>
+        </w:numPr>
+      </w:pPr>
+      <w:r>
+        <w:t>Loading screens at start and for scene transitions</w:t>
+      </w:r>
+    </w:p>
+    <w:p>
+      <w:pPr>
+        <w:numPr>
+          <w:ilvl w:val="0"/>
+          <w:numId w:val="3"/>
+        </w:numPr>
+      </w:pPr>
+      <w:r>
+        <w:t xml:space="preserve">Day/night transition, 1 day </w:t>
+      </w:r>
+      <w:r>
+        <w:t>=</w:t>
       </w:r>
       <w:r>
         <w:t xml:space="preserve"> </w:t>
       </w:r>
+      <w:r>
+        <w:t>6</w:t>
+      </w:r>
+      <w:r>
+        <w:t xml:space="preserve"> minutes</w:t>
+      </w:r>
     </w:p>
     <w:p>
       <w:pPr>
@@ -1084,7 +1256,11 @@
         </w:numPr>
       </w:pPr>
       <w:r>
-        <w:t>NPC resource gathering</w:t>
+        <w:lastRenderedPageBreak/>
+        <w:t>Weather and season change</w:t>
+      </w:r>
+      <w:r>
+        <w:t xml:space="preserve"> (enable/disable for some scenarios)</w:t>
       </w:r>
     </w:p>
     <w:p>
@@ -1095,71 +1271,11 @@
         </w:numPr>
       </w:pPr>
       <w:r>
-        <w:t>UI for workers’ allocation</w:t>
-      </w:r>
-    </w:p>
-    <w:p>
-      <w:pPr>
-        <w:numPr>
-          <w:ilvl w:val="0"/>
-          <w:numId w:val="3"/>
-        </w:numPr>
-      </w:pPr>
-      <w:r>
-        <w:t>Loading screens at start and for scene transitions</w:t>
-      </w:r>
-    </w:p>
-    <w:p>
-      <w:pPr>
-        <w:numPr>
-          <w:ilvl w:val="0"/>
-          <w:numId w:val="3"/>
-        </w:numPr>
-      </w:pPr>
-      <w:r>
-        <w:t xml:space="preserve">Day/night transition, 1 day </w:t>
-      </w:r>
-      <w:r>
-        <w:t>=</w:t>
-      </w:r>
-      <w:r>
-        <w:t xml:space="preserve"> </w:t>
-      </w:r>
-      <w:r>
-        <w:t>6</w:t>
-      </w:r>
-      <w:r>
-        <w:t xml:space="preserve"> minutes</w:t>
-      </w:r>
-    </w:p>
-    <w:p>
-      <w:pPr>
-        <w:numPr>
-          <w:ilvl w:val="0"/>
-          <w:numId w:val="3"/>
-        </w:numPr>
-      </w:pPr>
-      <w:r>
-        <w:t>Weather and season change</w:t>
-      </w:r>
-      <w:r>
-        <w:t xml:space="preserve"> (enable/disable for some scenarios)</w:t>
-      </w:r>
-    </w:p>
-    <w:p>
-      <w:pPr>
-        <w:numPr>
-          <w:ilvl w:val="0"/>
-          <w:numId w:val="3"/>
-        </w:numPr>
-      </w:pPr>
-      <w:r>
         <w:t>Defensive buildings</w:t>
       </w:r>
     </w:p>
     <w:p>
       <w:r>
-        <w:lastRenderedPageBreak/>
         <w:pict w14:anchorId="6D36ED86">
           <v:rect id="_x0000_i1027" style="width:0;height:1.5pt" o:hralign="center" o:hrstd="t" o:hr="t" fillcolor="#a0a0a0" stroked="f"/>
         </w:pict>
@@ -1629,6 +1745,7 @@
           <w:b/>
           <w:bCs/>
         </w:rPr>
+        <w:lastRenderedPageBreak/>
         <w:t>Point at a building/path + Button “D”</w:t>
       </w:r>
       <w:r>
@@ -1658,7 +1775,6 @@
     </w:p>
     <w:p>
       <w:r>
-        <w:lastRenderedPageBreak/>
         <w:pict w14:anchorId="7B1998C0">
           <v:rect id="_x0000_i1029" style="width:0;height:1.5pt" o:hralign="center" o:hrstd="t" o:hr="t" fillcolor="#a0a0a0" stroked="f"/>
         </w:pict>
@@ -3743,6 +3859,7 @@
   <w:style w:type="character" w:default="1" w:styleId="DefaultParagraphFont">
     <w:name w:val="Default Paragraph Font"/>
     <w:uiPriority w:val="1"/>
+    <w:semiHidden/>
     <w:unhideWhenUsed/>
   </w:style>
   <w:style w:type="table" w:default="1" w:styleId="TableNormal">

</xml_diff>

<commit_message>
bunch of assets for testing
</commit_message>
<xml_diff>
--- a/BuildNotes.docx
+++ b/BuildNotes.docx
@@ -595,22 +595,55 @@
         <w:t xml:space="preserve"> Add</w:t>
       </w:r>
       <w:r>
+        <w:t xml:space="preserve"> map</w:t>
+      </w:r>
+      <w:r>
         <w:t xml:space="preserve"> </w:t>
       </w:r>
       <w:r>
-        <w:t>map</w:t>
+        <w:t xml:space="preserve">with lifetime layout </w:t>
+      </w:r>
+      <w:r>
+        <w:t>and fog of war</w:t>
+      </w:r>
+      <w:r>
+        <w:t>.</w:t>
+      </w:r>
+    </w:p>
+    <w:p>
+      <w:pPr>
+        <w:numPr>
+          <w:ilvl w:val="0"/>
+          <w:numId w:val="5"/>
+        </w:numPr>
+      </w:pPr>
+      <w:r>
+        <w:rPr>
+          <w:b/>
+          <w:bCs/>
+        </w:rPr>
+        <w:t>Game goals:</w:t>
       </w:r>
       <w:r>
         <w:t xml:space="preserve"> </w:t>
       </w:r>
       <w:r>
-        <w:t xml:space="preserve">with lifetime layout </w:t>
-      </w:r>
-      <w:r>
-        <w:t>and fog of war</w:t>
-      </w:r>
-      <w:r>
-        <w:t>.</w:t>
+        <w:t>Add tasks</w:t>
+      </w:r>
+      <w:r>
+        <w:t xml:space="preserve"> in missions</w:t>
+      </w:r>
+      <w:r>
+        <w:t xml:space="preserve"> + win condition and</w:t>
+      </w:r>
+      <w:r>
+        <w:t xml:space="preserve"> </w:t>
+      </w:r>
+      <w:r>
+        <w:t>story-based</w:t>
+      </w:r>
+      <w:r>
+        <w:t xml:space="preserve"> campaign.</w:t>
       </w:r>
     </w:p>
     <w:p>
@@ -625,100 +658,73 @@
           <w:b/>
           <w:bCs/>
         </w:rPr>
-        <w:t>Game goals:</w:t>
+        <w:t>Options Menu:</w:t>
+      </w:r>
+      <w:r>
+        <w:t xml:space="preserve"> Sound/Music, </w:t>
+      </w:r>
+      <w:r>
+        <w:t>a</w:t>
+      </w:r>
+      <w:r>
+        <w:t>utosave time,</w:t>
+      </w:r>
+      <w:r>
+        <w:t xml:space="preserve"> camera speed</w:t>
+      </w:r>
+      <w:r>
+        <w:t>, brightness</w:t>
+      </w:r>
+      <w:r>
+        <w:t xml:space="preserve"> etc.</w:t>
       </w:r>
       <w:r>
         <w:t xml:space="preserve"> </w:t>
       </w:r>
-      <w:r>
-        <w:t>Add tasks</w:t>
-      </w:r>
-      <w:r>
-        <w:t xml:space="preserve"> in missions</w:t>
-      </w:r>
-      <w:r>
-        <w:t xml:space="preserve"> + win condition and</w:t>
-      </w:r>
-      <w:r>
+    </w:p>
+    <w:p>
+      <w:pPr>
+        <w:numPr>
+          <w:ilvl w:val="0"/>
+          <w:numId w:val="5"/>
+        </w:numPr>
+      </w:pPr>
+      <w:r>
+        <w:rPr>
+          <w:b/>
+          <w:bCs/>
+        </w:rPr>
+        <w:t xml:space="preserve">Steam </w:t>
+      </w:r>
+      <w:r>
+        <w:rPr>
+          <w:b/>
+          <w:bCs/>
+        </w:rPr>
+        <w:t>and</w:t>
+      </w:r>
+      <w:r>
+        <w:rPr>
+          <w:b/>
+          <w:bCs/>
+        </w:rPr>
         <w:t xml:space="preserve"> </w:t>
       </w:r>
-      <w:r>
-        <w:t>story-based</w:t>
-      </w:r>
-      <w:r>
-        <w:t xml:space="preserve"> campaign.</w:t>
-      </w:r>
-    </w:p>
-    <w:p>
-      <w:pPr>
-        <w:numPr>
-          <w:ilvl w:val="0"/>
-          <w:numId w:val="5"/>
-        </w:numPr>
-      </w:pPr>
-      <w:r>
-        <w:rPr>
-          <w:b/>
-          <w:bCs/>
-        </w:rPr>
-        <w:t>Options Menu:</w:t>
-      </w:r>
-      <w:r>
-        <w:t xml:space="preserve"> Sound/Music, </w:t>
-      </w:r>
-      <w:r>
-        <w:t>a</w:t>
-      </w:r>
-      <w:r>
-        <w:t>utosave time,</w:t>
-      </w:r>
-      <w:r>
-        <w:t xml:space="preserve"> camera speed</w:t>
-      </w:r>
-      <w:r>
-        <w:t>, brightness</w:t>
-      </w:r>
-      <w:r>
-        <w:t xml:space="preserve"> etc.</w:t>
-      </w:r>
-      <w:r>
-        <w:t xml:space="preserve"> </w:t>
-      </w:r>
-    </w:p>
-    <w:p>
-      <w:pPr>
-        <w:numPr>
-          <w:ilvl w:val="0"/>
-          <w:numId w:val="5"/>
-        </w:numPr>
-      </w:pPr>
-      <w:r>
-        <w:rPr>
-          <w:b/>
-          <w:bCs/>
-        </w:rPr>
-        <w:t xml:space="preserve">Steam </w:t>
-      </w:r>
-      <w:r>
-        <w:rPr>
-          <w:b/>
-          <w:bCs/>
-        </w:rPr>
-        <w:t>and</w:t>
-      </w:r>
-      <w:r>
-        <w:rPr>
-          <w:b/>
-          <w:bCs/>
-        </w:rPr>
-        <w:t xml:space="preserve"> </w:t>
-      </w:r>
-      <w:r>
-        <w:rPr>
-          <w:b/>
-          <w:bCs/>
-        </w:rPr>
-        <w:t>Itch.Io release:</w:t>
+      <w:proofErr w:type="spellStart"/>
+      <w:r>
+        <w:rPr>
+          <w:b/>
+          <w:bCs/>
+        </w:rPr>
+        <w:t>Itch.Io</w:t>
+      </w:r>
+      <w:proofErr w:type="spellEnd"/>
+      <w:r>
+        <w:rPr>
+          <w:b/>
+          <w:bCs/>
+        </w:rPr>
+        <w:t xml:space="preserve"> release:</w:t>
       </w:r>
       <w:r>
         <w:t xml:space="preserve"> Create a</w:t>
@@ -730,8 +736,13 @@
         <w:t xml:space="preserve"> page on Steam</w:t>
       </w:r>
       <w:r>
-        <w:t xml:space="preserve"> and Itch.Io</w:t>
-      </w:r>
+        <w:t xml:space="preserve"> and </w:t>
+      </w:r>
+      <w:proofErr w:type="spellStart"/>
+      <w:r>
+        <w:t>Itch.Io</w:t>
+      </w:r>
+      <w:proofErr w:type="spellEnd"/>
       <w:r>
         <w:t xml:space="preserve"> </w:t>
       </w:r>
@@ -1270,7 +1281,7 @@
     <w:p>
       <w:r>
         <w:pict w14:anchorId="560732DB">
-          <v:rect id="_x0000_i1034" style="width:0;height:1.5pt" o:hralign="center" o:hrstd="t" o:hr="t" fillcolor="#a0a0a0" stroked="f"/>
+          <v:rect id="_x0000_i1026" style="width:0;height:1.5pt" o:hralign="center" o:hrstd="t" o:hr="t" fillcolor="#a0a0a0" stroked="f"/>
         </w:pict>
       </w:r>
     </w:p>
@@ -1557,19 +1568,7 @@
         <w:t xml:space="preserve">Create Steam and </w:t>
       </w:r>
       <w:r>
-        <w:t>Itch. Io</w:t>
-      </w:r>
-      <w:r>
-        <w:t xml:space="preserve"> </w:t>
-      </w:r>
-      <w:r>
-        <w:t>page</w:t>
-      </w:r>
-      <w:r>
-        <w:t>s and</w:t>
-      </w:r>
-      <w:r>
-        <w:t xml:space="preserve"> </w:t>
+        <w:t xml:space="preserve">Itch. Io pages and </w:t>
       </w:r>
       <w:r>
         <w:t xml:space="preserve">release a demo </w:t>
@@ -1871,107 +1870,90 @@
           <w:b/>
           <w:bCs/>
         </w:rPr>
-        <w:t xml:space="preserve">Right Mouse Button + </w:t>
-      </w:r>
-      <w:r>
-        <w:rPr>
-          <w:b/>
-          <w:bCs/>
-        </w:rPr>
-        <w:t>WASD</w:t>
-      </w:r>
-      <w:r>
-        <w:rPr>
-          <w:b/>
-          <w:bCs/>
-        </w:rPr>
+        <w:t>Right Mouse Button + WASD:</w:t>
+      </w:r>
+      <w:r>
+        <w:t xml:space="preserve"> </w:t>
+      </w:r>
+      <w:r>
+        <w:t>Move</w:t>
+      </w:r>
+      <w:r>
+        <w:t xml:space="preserve"> the camera</w:t>
+      </w:r>
+    </w:p>
+    <w:p>
+      <w:pPr>
+        <w:numPr>
+          <w:ilvl w:val="0"/>
+          <w:numId w:val="7"/>
+        </w:numPr>
+      </w:pPr>
+      <w:r>
+        <w:rPr>
+          <w:b/>
+          <w:bCs/>
+        </w:rPr>
+        <w:t>Mouse scroll wheel:</w:t>
+      </w:r>
+      <w:r>
+        <w:t xml:space="preserve"> Zoom in/out</w:t>
+      </w:r>
+    </w:p>
+    <w:p>
+      <w:pPr>
+        <w:numPr>
+          <w:ilvl w:val="0"/>
+          <w:numId w:val="7"/>
+        </w:numPr>
+      </w:pPr>
+      <w:r>
+        <w:rPr>
+          <w:b/>
+          <w:bCs/>
+        </w:rPr>
+        <w:t>Button “R” + Mouse Scroll Wheel</w:t>
+      </w:r>
+      <w:r>
+        <w:t>: Rotate the building.</w:t>
+      </w:r>
+    </w:p>
+    <w:p>
+      <w:pPr>
+        <w:numPr>
+          <w:ilvl w:val="0"/>
+          <w:numId w:val="7"/>
+        </w:numPr>
+      </w:pPr>
+      <w:r>
+        <w:rPr>
+          <w:b/>
+          <w:bCs/>
+        </w:rPr>
+        <w:t>Point at a building/</w:t>
+      </w:r>
+      <w:r>
+        <w:rPr>
+          <w:b/>
+          <w:bCs/>
+        </w:rPr>
+        <w:t>object</w:t>
+      </w:r>
+      <w:r>
+        <w:rPr>
+          <w:b/>
+          <w:bCs/>
+        </w:rPr>
+        <w:t xml:space="preserve"> + Button “D”</w:t>
+      </w:r>
+      <w:r>
         <w:t>:</w:t>
       </w:r>
       <w:r>
-        <w:t xml:space="preserve"> </w:t>
-      </w:r>
-      <w:r>
-        <w:t>Move</w:t>
-      </w:r>
-      <w:r>
-        <w:t xml:space="preserve"> the camera</w:t>
-      </w:r>
-    </w:p>
-    <w:p>
-      <w:pPr>
-        <w:numPr>
-          <w:ilvl w:val="0"/>
-          <w:numId w:val="7"/>
-        </w:numPr>
-      </w:pPr>
-      <w:r>
-        <w:rPr>
-          <w:b/>
-          <w:bCs/>
-        </w:rPr>
-        <w:t>Mouse scroll wheel:</w:t>
-      </w:r>
-      <w:r>
-        <w:t xml:space="preserve"> Zoom in/out</w:t>
-      </w:r>
-    </w:p>
-    <w:p>
-      <w:pPr>
-        <w:numPr>
-          <w:ilvl w:val="0"/>
-          <w:numId w:val="7"/>
-        </w:numPr>
-      </w:pPr>
-      <w:r>
-        <w:rPr>
-          <w:b/>
-          <w:bCs/>
-        </w:rPr>
-        <w:t>Button “R” + Mouse Scroll Wheel</w:t>
-      </w:r>
-      <w:r>
-        <w:t>: Rotate the building.</w:t>
-      </w:r>
-    </w:p>
-    <w:p>
-      <w:pPr>
-        <w:numPr>
-          <w:ilvl w:val="0"/>
-          <w:numId w:val="7"/>
-        </w:numPr>
-      </w:pPr>
-      <w:r>
-        <w:rPr>
-          <w:b/>
-          <w:bCs/>
-        </w:rPr>
-        <w:t>Point at a building/</w:t>
-      </w:r>
-      <w:r>
-        <w:rPr>
-          <w:b/>
-          <w:bCs/>
-        </w:rPr>
-        <w:t>object</w:t>
-      </w:r>
-      <w:r>
-        <w:rPr>
-          <w:b/>
-          <w:bCs/>
-        </w:rPr>
-        <w:t xml:space="preserve"> + Button “D”</w:t>
-      </w:r>
-      <w:r>
-        <w:t>:</w:t>
-      </w:r>
-      <w:r>
         <w:t xml:space="preserve"> Delete the building/</w:t>
       </w:r>
       <w:r>
-        <w:t xml:space="preserve"> </w:t>
-      </w:r>
-      <w:r>
-        <w:t>object</w:t>
+        <w:t xml:space="preserve"> object</w:t>
       </w:r>
     </w:p>
     <w:p>
@@ -2093,6 +2075,8 @@
         <w:t>The “How to Play” section will be updated as more features are added to the game.</w:t>
       </w:r>
     </w:p>
+    <w:p/>
+    <w:p/>
     <w:p>
       <w:r>
         <w:rPr>
@@ -2943,7 +2927,7 @@
   <w:abstractNum w:abstractNumId="6" w15:restartNumberingAfterBreak="0">
     <w:nsid w:val="51EB588B"/>
     <w:multiLevelType w:val="hybridMultilevel"/>
-    <w:tmpl w:val="3E8A98A4"/>
+    <w:tmpl w:val="6EB8105A"/>
     <w:lvl w:ilvl="0" w:tplc="10090001">
       <w:start w:val="1"/>
       <w:numFmt w:val="bullet"/>
@@ -4100,6 +4084,7 @@
   <w:style w:type="character" w:default="1" w:styleId="DefaultParagraphFont">
     <w:name w:val="Default Paragraph Font"/>
     <w:uiPriority w:val="1"/>
+    <w:semiHidden/>
     <w:unhideWhenUsed/>
   </w:style>
   <w:style w:type="table" w:default="1" w:styleId="TableNormal">

</xml_diff>

<commit_message>
Minor fixes + Build
</commit_message>
<xml_diff>
--- a/BuildNotes.docx
+++ b/BuildNotes.docx
@@ -2086,7 +2086,15 @@
         <w:t>Results:</w:t>
       </w:r>
     </w:p>
-    <w:p/>
+    <w:p>
+      <w:r>
+        <w:t>Ideas:</w:t>
+      </w:r>
+      <w:r>
+        <w:br/>
+        <w:t>Add camera to unit (when player doesn’t touch the game for 2 min choose random NPC and change camera)</w:t>
+      </w:r>
+    </w:p>
     <w:sectPr>
       <w:pgSz w:w="12240" w:h="15840"/>
       <w:pgMar w:top="1440" w:right="1440" w:bottom="1440" w:left="1440" w:header="720" w:footer="720" w:gutter="0"/>

</xml_diff>